<commit_message>
Replace the in-memory item list with PostgreSQL, Sequelize, and Docker.
Co-authored-by: Cursor <cursoragent@cursor.com>
</commit_message>
<xml_diff>
--- a/ЛРШилов_А_А.docx
+++ b/ЛРШилов_А_А.docx
@@ -7508,6 +7508,9 @@
         <w:jc w:val="center"/>
       </w:pPr>
       <w:r>
+        <w:rPr>
+          <w:noProof/>
+        </w:rPr>
         <w:drawing>
           <wp:inline distT="0" distB="0" distL="0" distR="0" wp14:anchorId="3E862829" wp14:editId="17924160">
             <wp:extent cx="4135619" cy="5657850"/>
@@ -7716,6 +7719,9 @@
         <w:jc w:val="center"/>
       </w:pPr>
       <w:r>
+        <w:rPr>
+          <w:noProof/>
+        </w:rPr>
         <w:lastRenderedPageBreak/>
         <w:drawing>
           <wp:inline distT="0" distB="0" distL="0" distR="0" wp14:anchorId="2252F7D6" wp14:editId="1E849704">
@@ -7920,6 +7926,9 @@
         <w:jc w:val="center"/>
       </w:pPr>
       <w:r>
+        <w:rPr>
+          <w:noProof/>
+        </w:rPr>
         <w:lastRenderedPageBreak/>
         <w:drawing>
           <wp:inline distT="0" distB="0" distL="0" distR="0" wp14:anchorId="4D7BF6B8" wp14:editId="0B7305CA">
@@ -8108,6 +8117,9 @@
         <w:jc w:val="center"/>
       </w:pPr>
       <w:r>
+        <w:rPr>
+          <w:noProof/>
+        </w:rPr>
         <w:lastRenderedPageBreak/>
         <w:drawing>
           <wp:inline distT="0" distB="0" distL="0" distR="0" wp14:anchorId="3D9287BC" wp14:editId="57A102A6">
@@ -8235,18 +8247,7 @@
           <w:sz w:val="28"/>
           <w:szCs w:val="28"/>
         </w:rPr>
-        <w:t>http://localhost:3000/items/</w:t>
-      </w:r>
-      <w:r>
-        <w:rPr>
-          <w:rStyle w:val="HTML"/>
-          <w:rFonts w:ascii="Times New Roman" w:eastAsiaTheme="minorHAnsi" w:hAnsi="Times New Roman" w:cs="Times New Roman"/>
-          <w:i/>
-          <w:iCs/>
-          <w:sz w:val="28"/>
-          <w:szCs w:val="28"/>
-        </w:rPr>
-        <w:t>3</w:t>
+        <w:t>http://localhost:3000/items/3</w:t>
       </w:r>
       <w:r>
         <w:rPr>
@@ -8520,6 +8521,9 @@
         <w:jc w:val="center"/>
       </w:pPr>
       <w:r>
+        <w:rPr>
+          <w:noProof/>
+        </w:rPr>
         <w:lastRenderedPageBreak/>
         <w:drawing>
           <wp:inline distT="0" distB="0" distL="0" distR="0" wp14:anchorId="6AFEC1DF" wp14:editId="2B24BD89">
@@ -8714,6 +8718,9 @@
         <w:jc w:val="center"/>
       </w:pPr>
       <w:r>
+        <w:rPr>
+          <w:noProof/>
+        </w:rPr>
         <w:lastRenderedPageBreak/>
         <w:drawing>
           <wp:inline distT="0" distB="0" distL="0" distR="0" wp14:anchorId="769E66E3" wp14:editId="35DE08C7">
@@ -8816,6 +8823,2202 @@
         <w:lastRenderedPageBreak/>
         <w:t>4 ОТВЕТЫ НА КОНТРОЛЬНЫЕ ВОПРОСЫ</w:t>
       </w:r>
+    </w:p>
+    <w:p/>
+    <w:p>
+      <w:pPr>
+        <w:spacing w:after="0" w:line="360" w:lineRule="exact"/>
+        <w:rPr>
+          <w:rFonts w:eastAsia="Times New Roman" w:cs="Times New Roman"/>
+          <w:szCs w:val="28"/>
+        </w:rPr>
+      </w:pPr>
+      <w:r>
+        <w:rPr>
+          <w:rFonts w:eastAsia="Times New Roman" w:cs="Times New Roman"/>
+          <w:szCs w:val="28"/>
+        </w:rPr>
+        <w:t xml:space="preserve">В нашей работе реализованы четыре основных метода </w:t>
+      </w:r>
+      <w:r>
+        <w:rPr>
+          <w:rFonts w:eastAsia="Times New Roman" w:cs="Times New Roman"/>
+          <w:i/>
+          <w:iCs/>
+          <w:szCs w:val="28"/>
+        </w:rPr>
+        <w:t>HTTP</w:t>
+      </w:r>
+      <w:r>
+        <w:rPr>
+          <w:rFonts w:eastAsia="Times New Roman" w:cs="Times New Roman"/>
+          <w:szCs w:val="28"/>
+        </w:rPr>
+        <w:t xml:space="preserve">: </w:t>
+      </w:r>
+      <w:r>
+        <w:rPr>
+          <w:rFonts w:eastAsia="Times New Roman" w:cs="Times New Roman"/>
+          <w:i/>
+          <w:iCs/>
+          <w:szCs w:val="28"/>
+        </w:rPr>
+        <w:t>GET</w:t>
+      </w:r>
+      <w:r>
+        <w:rPr>
+          <w:rFonts w:eastAsia="Times New Roman" w:cs="Times New Roman"/>
+          <w:szCs w:val="28"/>
+        </w:rPr>
+        <w:t xml:space="preserve"> используется для получения списка всех </w:t>
+      </w:r>
+      <w:r>
+        <w:rPr>
+          <w:rFonts w:eastAsia="Times New Roman" w:cs="Times New Roman"/>
+          <w:szCs w:val="28"/>
+        </w:rPr>
+        <w:t>предметов</w:t>
+      </w:r>
+      <w:r>
+        <w:rPr>
+          <w:rFonts w:eastAsia="Times New Roman" w:cs="Times New Roman"/>
+          <w:szCs w:val="28"/>
+        </w:rPr>
+        <w:t xml:space="preserve"> и одного </w:t>
+      </w:r>
+      <w:r>
+        <w:rPr>
+          <w:rFonts w:eastAsia="Times New Roman" w:cs="Times New Roman"/>
+          <w:szCs w:val="28"/>
+        </w:rPr>
+        <w:t>предмета</w:t>
+      </w:r>
+      <w:r>
+        <w:rPr>
+          <w:rFonts w:eastAsia="Times New Roman" w:cs="Times New Roman"/>
+          <w:szCs w:val="28"/>
+        </w:rPr>
+        <w:t xml:space="preserve"> по </w:t>
+      </w:r>
+      <w:r>
+        <w:rPr>
+          <w:rFonts w:eastAsia="Times New Roman" w:cs="Times New Roman"/>
+          <w:i/>
+          <w:iCs/>
+          <w:szCs w:val="28"/>
+        </w:rPr>
+        <w:t>ID</w:t>
+      </w:r>
+      <w:r>
+        <w:rPr>
+          <w:rFonts w:eastAsia="Times New Roman" w:cs="Times New Roman"/>
+          <w:szCs w:val="28"/>
+        </w:rPr>
+        <w:t xml:space="preserve">, </w:t>
+      </w:r>
+      <w:r>
+        <w:rPr>
+          <w:rFonts w:eastAsia="Times New Roman" w:cs="Times New Roman"/>
+          <w:i/>
+          <w:iCs/>
+          <w:szCs w:val="28"/>
+        </w:rPr>
+        <w:t>POST</w:t>
+      </w:r>
+      <w:r>
+        <w:rPr>
+          <w:rFonts w:eastAsia="Times New Roman" w:cs="Times New Roman"/>
+          <w:szCs w:val="28"/>
+        </w:rPr>
+        <w:t xml:space="preserve"> — для создания нового бага, </w:t>
+      </w:r>
+      <w:r>
+        <w:rPr>
+          <w:rFonts w:eastAsia="Times New Roman" w:cs="Times New Roman"/>
+          <w:i/>
+          <w:iCs/>
+          <w:szCs w:val="28"/>
+        </w:rPr>
+        <w:t>PUT</w:t>
+      </w:r>
+      <w:r>
+        <w:rPr>
+          <w:rFonts w:eastAsia="Times New Roman" w:cs="Times New Roman"/>
+          <w:szCs w:val="28"/>
+        </w:rPr>
+        <w:t xml:space="preserve"> — для полного обновления существующего бага, </w:t>
+      </w:r>
+      <w:r>
+        <w:rPr>
+          <w:rFonts w:eastAsia="Times New Roman" w:cs="Times New Roman"/>
+          <w:i/>
+          <w:iCs/>
+          <w:szCs w:val="28"/>
+        </w:rPr>
+        <w:t>DELETE</w:t>
+      </w:r>
+      <w:r>
+        <w:rPr>
+          <w:rFonts w:eastAsia="Times New Roman" w:cs="Times New Roman"/>
+          <w:szCs w:val="28"/>
+        </w:rPr>
+        <w:t xml:space="preserve"> — для удаления бага по </w:t>
+      </w:r>
+      <w:r>
+        <w:rPr>
+          <w:rFonts w:eastAsia="Times New Roman" w:cs="Times New Roman"/>
+          <w:i/>
+          <w:iCs/>
+          <w:szCs w:val="28"/>
+        </w:rPr>
+        <w:t>ID</w:t>
+      </w:r>
+      <w:r>
+        <w:rPr>
+          <w:rFonts w:eastAsia="Times New Roman" w:cs="Times New Roman"/>
+          <w:szCs w:val="28"/>
+        </w:rPr>
+        <w:t xml:space="preserve">; метод </w:t>
+      </w:r>
+      <w:r>
+        <w:rPr>
+          <w:rFonts w:eastAsia="Times New Roman" w:cs="Times New Roman"/>
+          <w:i/>
+          <w:iCs/>
+          <w:szCs w:val="28"/>
+        </w:rPr>
+        <w:t>PATCH</w:t>
+      </w:r>
+      <w:r>
+        <w:rPr>
+          <w:rFonts w:eastAsia="Times New Roman" w:cs="Times New Roman"/>
+          <w:szCs w:val="28"/>
+        </w:rPr>
+        <w:t xml:space="preserve"> не реализован, так как по заданию требуется именно полное обновление через </w:t>
+      </w:r>
+      <w:r>
+        <w:rPr>
+          <w:rFonts w:eastAsia="Times New Roman" w:cs="Times New Roman"/>
+          <w:i/>
+          <w:iCs/>
+          <w:szCs w:val="28"/>
+        </w:rPr>
+        <w:t>PUT</w:t>
+      </w:r>
+      <w:r>
+        <w:rPr>
+          <w:rFonts w:eastAsia="Times New Roman" w:cs="Times New Roman"/>
+          <w:szCs w:val="28"/>
+        </w:rPr>
+        <w:t>.</w:t>
+      </w:r>
+    </w:p>
+    <w:p>
+      <w:pPr>
+        <w:spacing w:after="0" w:line="360" w:lineRule="exact"/>
+        <w:rPr>
+          <w:rFonts w:eastAsia="Times New Roman" w:cs="Times New Roman"/>
+          <w:szCs w:val="28"/>
+        </w:rPr>
+      </w:pPr>
+      <w:r>
+        <w:rPr>
+          <w:rFonts w:eastAsia="Times New Roman" w:cs="Times New Roman"/>
+          <w:szCs w:val="28"/>
+        </w:rPr>
+        <w:t xml:space="preserve">Для получения параметров из URL в </w:t>
+      </w:r>
+      <w:r>
+        <w:rPr>
+          <w:rFonts w:eastAsia="Times New Roman" w:cs="Times New Roman"/>
+          <w:i/>
+          <w:iCs/>
+          <w:szCs w:val="28"/>
+        </w:rPr>
+        <w:t>Express</w:t>
+      </w:r>
+      <w:r>
+        <w:rPr>
+          <w:rFonts w:eastAsia="Times New Roman" w:cs="Times New Roman"/>
+          <w:szCs w:val="28"/>
+        </w:rPr>
+        <w:t xml:space="preserve"> используется объект `</w:t>
+      </w:r>
+      <w:proofErr w:type="spellStart"/>
+      <w:proofErr w:type="gramStart"/>
+      <w:r>
+        <w:rPr>
+          <w:rFonts w:eastAsia="Times New Roman" w:cs="Times New Roman"/>
+          <w:i/>
+          <w:iCs/>
+          <w:szCs w:val="28"/>
+        </w:rPr>
+        <w:t>req</w:t>
+      </w:r>
+      <w:r>
+        <w:rPr>
+          <w:rFonts w:eastAsia="Times New Roman" w:cs="Times New Roman"/>
+          <w:szCs w:val="28"/>
+        </w:rPr>
+        <w:t>.</w:t>
+      </w:r>
+      <w:r>
+        <w:rPr>
+          <w:rFonts w:eastAsia="Times New Roman" w:cs="Times New Roman"/>
+          <w:i/>
+          <w:iCs/>
+          <w:szCs w:val="28"/>
+        </w:rPr>
+        <w:t>params</w:t>
+      </w:r>
+      <w:proofErr w:type="spellEnd"/>
+      <w:proofErr w:type="gramEnd"/>
+      <w:r>
+        <w:rPr>
+          <w:rFonts w:eastAsia="Times New Roman" w:cs="Times New Roman"/>
+          <w:szCs w:val="28"/>
+        </w:rPr>
+        <w:t>` (например, `</w:t>
+      </w:r>
+      <w:r>
+        <w:rPr>
+          <w:rFonts w:eastAsia="Times New Roman" w:cs="Times New Roman"/>
+          <w:i/>
+          <w:iCs/>
+          <w:szCs w:val="28"/>
+        </w:rPr>
+        <w:t>req</w:t>
+      </w:r>
+      <w:r>
+        <w:rPr>
+          <w:rFonts w:eastAsia="Times New Roman" w:cs="Times New Roman"/>
+          <w:szCs w:val="28"/>
+        </w:rPr>
+        <w:t>.</w:t>
+      </w:r>
+      <w:r>
+        <w:rPr>
+          <w:rFonts w:eastAsia="Times New Roman" w:cs="Times New Roman"/>
+          <w:i/>
+          <w:iCs/>
+          <w:szCs w:val="28"/>
+        </w:rPr>
+        <w:t>params</w:t>
+      </w:r>
+      <w:r>
+        <w:rPr>
+          <w:rFonts w:eastAsia="Times New Roman" w:cs="Times New Roman"/>
+          <w:szCs w:val="28"/>
+        </w:rPr>
+        <w:t>.</w:t>
+      </w:r>
+      <w:r>
+        <w:rPr>
+          <w:rFonts w:eastAsia="Times New Roman" w:cs="Times New Roman"/>
+          <w:i/>
+          <w:iCs/>
+          <w:szCs w:val="28"/>
+        </w:rPr>
+        <w:t>id</w:t>
+      </w:r>
+      <w:r>
+        <w:rPr>
+          <w:rFonts w:eastAsia="Times New Roman" w:cs="Times New Roman"/>
+          <w:szCs w:val="28"/>
+        </w:rPr>
+        <w:t>` для маршрута `/</w:t>
+      </w:r>
+      <w:r>
+        <w:rPr>
+          <w:rFonts w:eastAsia="Times New Roman" w:cs="Times New Roman"/>
+          <w:i/>
+          <w:iCs/>
+          <w:szCs w:val="28"/>
+          <w:lang w:val="en-US"/>
+        </w:rPr>
+        <w:t>items</w:t>
+      </w:r>
+      <w:r>
+        <w:rPr>
+          <w:rFonts w:eastAsia="Times New Roman" w:cs="Times New Roman"/>
+          <w:szCs w:val="28"/>
+        </w:rPr>
+        <w:t>/:</w:t>
+      </w:r>
+      <w:proofErr w:type="spellStart"/>
+      <w:r>
+        <w:rPr>
+          <w:rFonts w:eastAsia="Times New Roman" w:cs="Times New Roman"/>
+          <w:i/>
+          <w:iCs/>
+          <w:szCs w:val="28"/>
+        </w:rPr>
+        <w:t>id</w:t>
+      </w:r>
+      <w:proofErr w:type="spellEnd"/>
+      <w:r>
+        <w:rPr>
+          <w:rFonts w:eastAsia="Times New Roman" w:cs="Times New Roman"/>
+          <w:szCs w:val="28"/>
+        </w:rPr>
+        <w:t>`), а для строки запроса — объект `</w:t>
+      </w:r>
+      <w:proofErr w:type="spellStart"/>
+      <w:r>
+        <w:rPr>
+          <w:rFonts w:eastAsia="Times New Roman" w:cs="Times New Roman"/>
+          <w:i/>
+          <w:iCs/>
+          <w:szCs w:val="28"/>
+        </w:rPr>
+        <w:t>req</w:t>
+      </w:r>
+      <w:r>
+        <w:rPr>
+          <w:rFonts w:eastAsia="Times New Roman" w:cs="Times New Roman"/>
+          <w:szCs w:val="28"/>
+        </w:rPr>
+        <w:t>.</w:t>
+      </w:r>
+      <w:r>
+        <w:rPr>
+          <w:rFonts w:eastAsia="Times New Roman" w:cs="Times New Roman"/>
+          <w:i/>
+          <w:iCs/>
+          <w:szCs w:val="28"/>
+        </w:rPr>
+        <w:t>query</w:t>
+      </w:r>
+      <w:proofErr w:type="spellEnd"/>
+      <w:r>
+        <w:rPr>
+          <w:rFonts w:eastAsia="Times New Roman" w:cs="Times New Roman"/>
+          <w:szCs w:val="28"/>
+        </w:rPr>
+        <w:t>` (например, `</w:t>
+      </w:r>
+      <w:proofErr w:type="spellStart"/>
+      <w:r>
+        <w:rPr>
+          <w:rFonts w:eastAsia="Times New Roman" w:cs="Times New Roman"/>
+          <w:i/>
+          <w:iCs/>
+          <w:szCs w:val="28"/>
+        </w:rPr>
+        <w:t>req</w:t>
+      </w:r>
+      <w:r>
+        <w:rPr>
+          <w:rFonts w:eastAsia="Times New Roman" w:cs="Times New Roman"/>
+          <w:szCs w:val="28"/>
+        </w:rPr>
+        <w:t>.</w:t>
+      </w:r>
+      <w:r>
+        <w:rPr>
+          <w:rFonts w:eastAsia="Times New Roman" w:cs="Times New Roman"/>
+          <w:i/>
+          <w:iCs/>
+          <w:szCs w:val="28"/>
+        </w:rPr>
+        <w:t>query</w:t>
+      </w:r>
+      <w:r>
+        <w:rPr>
+          <w:rFonts w:eastAsia="Times New Roman" w:cs="Times New Roman"/>
+          <w:szCs w:val="28"/>
+        </w:rPr>
+        <w:t>.</w:t>
+      </w:r>
+      <w:r>
+        <w:rPr>
+          <w:rFonts w:eastAsia="Times New Roman" w:cs="Times New Roman"/>
+          <w:i/>
+          <w:iCs/>
+          <w:szCs w:val="28"/>
+        </w:rPr>
+        <w:t>status</w:t>
+      </w:r>
+      <w:proofErr w:type="spellEnd"/>
+      <w:r>
+        <w:rPr>
+          <w:rFonts w:eastAsia="Times New Roman" w:cs="Times New Roman"/>
+          <w:szCs w:val="28"/>
+        </w:rPr>
+        <w:t xml:space="preserve">` для </w:t>
+      </w:r>
+      <w:r>
+        <w:rPr>
+          <w:i/>
+          <w:iCs/>
+        </w:rPr>
+        <w:t>URL</w:t>
+      </w:r>
+      <w:r>
+        <w:rPr>
+          <w:rFonts w:eastAsia="Times New Roman" w:cs="Times New Roman"/>
+          <w:szCs w:val="28"/>
+        </w:rPr>
+        <w:t xml:space="preserve"> `/</w:t>
+      </w:r>
+      <w:proofErr w:type="spellStart"/>
+      <w:r>
+        <w:rPr>
+          <w:rFonts w:eastAsia="Times New Roman" w:cs="Times New Roman"/>
+          <w:i/>
+          <w:iCs/>
+          <w:szCs w:val="28"/>
+        </w:rPr>
+        <w:t>bugs</w:t>
+      </w:r>
+      <w:r>
+        <w:rPr>
+          <w:rFonts w:eastAsia="Times New Roman" w:cs="Times New Roman"/>
+          <w:szCs w:val="28"/>
+        </w:rPr>
+        <w:t>?</w:t>
+      </w:r>
+      <w:r>
+        <w:rPr>
+          <w:rFonts w:eastAsia="Times New Roman" w:cs="Times New Roman"/>
+          <w:i/>
+          <w:iCs/>
+          <w:szCs w:val="28"/>
+        </w:rPr>
+        <w:t>status</w:t>
+      </w:r>
+      <w:proofErr w:type="spellEnd"/>
+      <w:r>
+        <w:rPr>
+          <w:rFonts w:eastAsia="Times New Roman" w:cs="Times New Roman"/>
+          <w:szCs w:val="28"/>
+        </w:rPr>
+        <w:t>=Новый`).</w:t>
+      </w:r>
+    </w:p>
+    <w:p>
+      <w:pPr>
+        <w:spacing w:after="0" w:line="360" w:lineRule="exact"/>
+        <w:rPr>
+          <w:rFonts w:eastAsia="Times New Roman" w:cs="Times New Roman"/>
+          <w:szCs w:val="28"/>
+        </w:rPr>
+      </w:pPr>
+      <w:proofErr w:type="spellStart"/>
+      <w:r>
+        <w:rPr>
+          <w:rFonts w:eastAsia="Times New Roman" w:cs="Times New Roman"/>
+          <w:i/>
+          <w:iCs/>
+          <w:szCs w:val="28"/>
+        </w:rPr>
+        <w:t>Middleware</w:t>
+      </w:r>
+      <w:proofErr w:type="spellEnd"/>
+      <w:r>
+        <w:rPr>
+          <w:rFonts w:eastAsia="Times New Roman" w:cs="Times New Roman"/>
+          <w:szCs w:val="28"/>
+        </w:rPr>
+        <w:t xml:space="preserve"> `</w:t>
+      </w:r>
+      <w:proofErr w:type="spellStart"/>
+      <w:proofErr w:type="gramStart"/>
+      <w:r>
+        <w:rPr>
+          <w:rFonts w:eastAsia="Times New Roman" w:cs="Times New Roman"/>
+          <w:i/>
+          <w:iCs/>
+          <w:szCs w:val="28"/>
+        </w:rPr>
+        <w:t>express</w:t>
+      </w:r>
+      <w:r>
+        <w:rPr>
+          <w:rFonts w:eastAsia="Times New Roman" w:cs="Times New Roman"/>
+          <w:szCs w:val="28"/>
+        </w:rPr>
+        <w:t>.</w:t>
+      </w:r>
+      <w:r>
+        <w:rPr>
+          <w:rFonts w:eastAsia="Times New Roman" w:cs="Times New Roman"/>
+          <w:i/>
+          <w:iCs/>
+          <w:szCs w:val="28"/>
+        </w:rPr>
+        <w:t>json</w:t>
+      </w:r>
+      <w:proofErr w:type="spellEnd"/>
+      <w:proofErr w:type="gramEnd"/>
+      <w:r>
+        <w:rPr>
+          <w:rFonts w:eastAsia="Times New Roman" w:cs="Times New Roman"/>
+          <w:szCs w:val="28"/>
+        </w:rPr>
+        <w:t xml:space="preserve">()` необходим для автоматического </w:t>
+      </w:r>
+      <w:proofErr w:type="spellStart"/>
+      <w:r>
+        <w:rPr>
+          <w:rFonts w:eastAsia="Times New Roman" w:cs="Times New Roman"/>
+          <w:szCs w:val="28"/>
+        </w:rPr>
+        <w:t>парсинга</w:t>
+      </w:r>
+      <w:proofErr w:type="spellEnd"/>
+      <w:r>
+        <w:rPr>
+          <w:rFonts w:eastAsia="Times New Roman" w:cs="Times New Roman"/>
+          <w:szCs w:val="28"/>
+        </w:rPr>
+        <w:t xml:space="preserve"> JSON-тела запроса: он проверяет заголовок `</w:t>
+      </w:r>
+      <w:r>
+        <w:rPr>
+          <w:rFonts w:eastAsia="Times New Roman" w:cs="Times New Roman"/>
+          <w:i/>
+          <w:iCs/>
+          <w:szCs w:val="28"/>
+        </w:rPr>
+        <w:t>Content</w:t>
+      </w:r>
+      <w:r>
+        <w:rPr>
+          <w:rFonts w:eastAsia="Times New Roman" w:cs="Times New Roman"/>
+          <w:szCs w:val="28"/>
+        </w:rPr>
+        <w:t>-</w:t>
+      </w:r>
+      <w:r>
+        <w:rPr>
+          <w:rFonts w:eastAsia="Times New Roman" w:cs="Times New Roman"/>
+          <w:i/>
+          <w:iCs/>
+          <w:szCs w:val="28"/>
+        </w:rPr>
+        <w:t>Type</w:t>
+      </w:r>
+      <w:r>
+        <w:rPr>
+          <w:rFonts w:eastAsia="Times New Roman" w:cs="Times New Roman"/>
+          <w:szCs w:val="28"/>
+        </w:rPr>
+        <w:t xml:space="preserve">: </w:t>
+      </w:r>
+      <w:proofErr w:type="spellStart"/>
+      <w:r>
+        <w:rPr>
+          <w:rFonts w:eastAsia="Times New Roman" w:cs="Times New Roman"/>
+          <w:i/>
+          <w:iCs/>
+          <w:szCs w:val="28"/>
+        </w:rPr>
+        <w:t>application</w:t>
+      </w:r>
+      <w:proofErr w:type="spellEnd"/>
+      <w:r>
+        <w:rPr>
+          <w:rFonts w:eastAsia="Times New Roman" w:cs="Times New Roman"/>
+          <w:szCs w:val="28"/>
+        </w:rPr>
+        <w:t>/</w:t>
+      </w:r>
+      <w:proofErr w:type="spellStart"/>
+      <w:r>
+        <w:rPr>
+          <w:rFonts w:eastAsia="Times New Roman" w:cs="Times New Roman"/>
+          <w:i/>
+          <w:iCs/>
+          <w:szCs w:val="28"/>
+        </w:rPr>
+        <w:t>json</w:t>
+      </w:r>
+      <w:proofErr w:type="spellEnd"/>
+      <w:r>
+        <w:rPr>
+          <w:rFonts w:eastAsia="Times New Roman" w:cs="Times New Roman"/>
+          <w:szCs w:val="28"/>
+        </w:rPr>
+        <w:t xml:space="preserve">`, преобразует JSON в </w:t>
+      </w:r>
+      <w:r>
+        <w:rPr>
+          <w:rFonts w:eastAsia="Times New Roman" w:cs="Times New Roman"/>
+          <w:i/>
+          <w:iCs/>
+          <w:szCs w:val="28"/>
+        </w:rPr>
+        <w:t>JavaScript</w:t>
+      </w:r>
+      <w:r>
+        <w:rPr>
+          <w:rFonts w:eastAsia="Times New Roman" w:cs="Times New Roman"/>
+          <w:szCs w:val="28"/>
+        </w:rPr>
+        <w:t>-объект и сохраняет его в `</w:t>
+      </w:r>
+      <w:proofErr w:type="spellStart"/>
+      <w:r>
+        <w:rPr>
+          <w:rFonts w:eastAsia="Times New Roman" w:cs="Times New Roman"/>
+          <w:i/>
+          <w:iCs/>
+          <w:szCs w:val="28"/>
+        </w:rPr>
+        <w:t>req</w:t>
+      </w:r>
+      <w:r>
+        <w:rPr>
+          <w:rFonts w:eastAsia="Times New Roman" w:cs="Times New Roman"/>
+          <w:szCs w:val="28"/>
+        </w:rPr>
+        <w:t>.</w:t>
+      </w:r>
+      <w:r>
+        <w:rPr>
+          <w:rFonts w:eastAsia="Times New Roman" w:cs="Times New Roman"/>
+          <w:i/>
+          <w:iCs/>
+          <w:szCs w:val="28"/>
+        </w:rPr>
+        <w:t>body</w:t>
+      </w:r>
+      <w:proofErr w:type="spellEnd"/>
+      <w:r>
+        <w:rPr>
+          <w:rFonts w:eastAsia="Times New Roman" w:cs="Times New Roman"/>
+          <w:szCs w:val="28"/>
+        </w:rPr>
+        <w:t>`, без него `</w:t>
+      </w:r>
+      <w:proofErr w:type="spellStart"/>
+      <w:r>
+        <w:rPr>
+          <w:rFonts w:eastAsia="Times New Roman" w:cs="Times New Roman"/>
+          <w:i/>
+          <w:iCs/>
+          <w:szCs w:val="28"/>
+        </w:rPr>
+        <w:t>req</w:t>
+      </w:r>
+      <w:r>
+        <w:rPr>
+          <w:rFonts w:eastAsia="Times New Roman" w:cs="Times New Roman"/>
+          <w:szCs w:val="28"/>
+        </w:rPr>
+        <w:t>.</w:t>
+      </w:r>
+      <w:r>
+        <w:rPr>
+          <w:rFonts w:eastAsia="Times New Roman" w:cs="Times New Roman"/>
+          <w:i/>
+          <w:iCs/>
+          <w:szCs w:val="28"/>
+        </w:rPr>
+        <w:t>body</w:t>
+      </w:r>
+      <w:proofErr w:type="spellEnd"/>
+      <w:r>
+        <w:rPr>
+          <w:rFonts w:eastAsia="Times New Roman" w:cs="Times New Roman"/>
+          <w:szCs w:val="28"/>
+        </w:rPr>
+        <w:t>` всегда будет `</w:t>
+      </w:r>
+      <w:proofErr w:type="spellStart"/>
+      <w:r>
+        <w:rPr>
+          <w:rFonts w:eastAsia="Times New Roman" w:cs="Times New Roman"/>
+          <w:i/>
+          <w:iCs/>
+          <w:szCs w:val="28"/>
+        </w:rPr>
+        <w:t>undefined</w:t>
+      </w:r>
+      <w:proofErr w:type="spellEnd"/>
+      <w:r>
+        <w:rPr>
+          <w:rFonts w:eastAsia="Times New Roman" w:cs="Times New Roman"/>
+          <w:szCs w:val="28"/>
+        </w:rPr>
+        <w:t>`.</w:t>
+      </w:r>
+    </w:p>
+    <w:p>
+      <w:pPr>
+        <w:spacing w:after="0" w:line="360" w:lineRule="exact"/>
+        <w:rPr>
+          <w:rFonts w:eastAsia="Times New Roman" w:cs="Times New Roman"/>
+          <w:szCs w:val="28"/>
+        </w:rPr>
+      </w:pPr>
+      <w:r>
+        <w:rPr>
+          <w:rFonts w:eastAsia="Times New Roman" w:cs="Times New Roman"/>
+          <w:szCs w:val="28"/>
+        </w:rPr>
+        <w:t xml:space="preserve">При успешном создании ресурса возвращается статус 201 </w:t>
+      </w:r>
+      <w:proofErr w:type="spellStart"/>
+      <w:r>
+        <w:rPr>
+          <w:rFonts w:eastAsia="Times New Roman" w:cs="Times New Roman"/>
+          <w:i/>
+          <w:iCs/>
+          <w:szCs w:val="28"/>
+        </w:rPr>
+        <w:t>Created</w:t>
+      </w:r>
+      <w:proofErr w:type="spellEnd"/>
+      <w:r>
+        <w:rPr>
+          <w:rFonts w:eastAsia="Times New Roman" w:cs="Times New Roman"/>
+          <w:szCs w:val="28"/>
+        </w:rPr>
+        <w:t xml:space="preserve">, а при успешном удалении — 204 </w:t>
+      </w:r>
+      <w:r>
+        <w:rPr>
+          <w:rFonts w:eastAsia="Times New Roman" w:cs="Times New Roman"/>
+          <w:i/>
+          <w:iCs/>
+          <w:szCs w:val="28"/>
+        </w:rPr>
+        <w:t>No</w:t>
+      </w:r>
+      <w:r>
+        <w:rPr>
+          <w:rFonts w:eastAsia="Times New Roman" w:cs="Times New Roman"/>
+          <w:szCs w:val="28"/>
+        </w:rPr>
+        <w:t xml:space="preserve"> </w:t>
+      </w:r>
+      <w:r>
+        <w:rPr>
+          <w:rFonts w:eastAsia="Times New Roman" w:cs="Times New Roman"/>
+          <w:i/>
+          <w:iCs/>
+          <w:szCs w:val="28"/>
+        </w:rPr>
+        <w:t>Content</w:t>
+      </w:r>
+      <w:r>
+        <w:rPr>
+          <w:rFonts w:eastAsia="Times New Roman" w:cs="Times New Roman"/>
+          <w:szCs w:val="28"/>
+        </w:rPr>
+        <w:t xml:space="preserve"> (пустое тело ответа).</w:t>
+      </w:r>
+    </w:p>
+    <w:p>
+      <w:pPr>
+        <w:spacing w:after="0" w:line="360" w:lineRule="exact"/>
+        <w:rPr>
+          <w:rFonts w:eastAsia="Times New Roman" w:cs="Times New Roman"/>
+          <w:szCs w:val="28"/>
+        </w:rPr>
+      </w:pPr>
+      <w:r>
+        <w:rPr>
+          <w:rFonts w:eastAsia="Times New Roman" w:cs="Times New Roman"/>
+          <w:szCs w:val="28"/>
+        </w:rPr>
+        <w:t>REST API — это архитектурный стиль взаимодействия клиента и сервера, основанный на следующих принципах: клиент-серверная архитектура, отсутствие состояния (</w:t>
+      </w:r>
+      <w:proofErr w:type="spellStart"/>
+      <w:r>
+        <w:rPr>
+          <w:rFonts w:eastAsia="Times New Roman" w:cs="Times New Roman"/>
+          <w:i/>
+          <w:iCs/>
+          <w:szCs w:val="28"/>
+        </w:rPr>
+        <w:t>stateless</w:t>
+      </w:r>
+      <w:proofErr w:type="spellEnd"/>
+      <w:r>
+        <w:rPr>
+          <w:rFonts w:eastAsia="Times New Roman" w:cs="Times New Roman"/>
+          <w:szCs w:val="28"/>
+        </w:rPr>
+        <w:t xml:space="preserve">), </w:t>
+      </w:r>
+      <w:proofErr w:type="spellStart"/>
+      <w:r>
+        <w:rPr>
+          <w:rFonts w:eastAsia="Times New Roman" w:cs="Times New Roman"/>
+          <w:szCs w:val="28"/>
+        </w:rPr>
+        <w:t>кешируемость</w:t>
+      </w:r>
+      <w:proofErr w:type="spellEnd"/>
+      <w:r>
+        <w:rPr>
+          <w:rFonts w:eastAsia="Times New Roman" w:cs="Times New Roman"/>
+          <w:szCs w:val="28"/>
+        </w:rPr>
+        <w:t xml:space="preserve">, единообразие интерфейса (использование стандартных </w:t>
+      </w:r>
+      <w:r>
+        <w:rPr>
+          <w:rFonts w:eastAsia="Times New Roman" w:cs="Times New Roman"/>
+          <w:i/>
+          <w:iCs/>
+          <w:szCs w:val="28"/>
+        </w:rPr>
+        <w:t>HTTP</w:t>
+      </w:r>
+      <w:r>
+        <w:rPr>
+          <w:rFonts w:eastAsia="Times New Roman" w:cs="Times New Roman"/>
+          <w:szCs w:val="28"/>
+        </w:rPr>
+        <w:t xml:space="preserve">-методов и </w:t>
+      </w:r>
+      <w:r>
+        <w:rPr>
+          <w:rFonts w:eastAsia="Times New Roman" w:cs="Times New Roman"/>
+          <w:i/>
+          <w:iCs/>
+          <w:szCs w:val="28"/>
+        </w:rPr>
+        <w:t>URL</w:t>
+      </w:r>
+      <w:r>
+        <w:rPr>
+          <w:rFonts w:eastAsia="Times New Roman" w:cs="Times New Roman"/>
+          <w:szCs w:val="28"/>
+        </w:rPr>
+        <w:t xml:space="preserve"> для идентификации ресурсов), многоуровневая система и </w:t>
+      </w:r>
+      <w:proofErr w:type="spellStart"/>
+      <w:r>
+        <w:rPr>
+          <w:rFonts w:eastAsia="Times New Roman" w:cs="Times New Roman"/>
+          <w:szCs w:val="28"/>
+        </w:rPr>
+        <w:t>опциональность</w:t>
+      </w:r>
+      <w:proofErr w:type="spellEnd"/>
+      <w:r>
+        <w:rPr>
+          <w:rFonts w:eastAsia="Times New Roman" w:cs="Times New Roman"/>
+          <w:szCs w:val="28"/>
+        </w:rPr>
+        <w:t xml:space="preserve"> кода по требованию.</w:t>
+      </w:r>
+    </w:p>
+    <w:p>
+      <w:pPr>
+        <w:spacing w:after="0" w:line="360" w:lineRule="exact"/>
+        <w:rPr>
+          <w:rFonts w:eastAsia="Times New Roman" w:cs="Times New Roman"/>
+          <w:szCs w:val="28"/>
+        </w:rPr>
+      </w:pPr>
+      <w:r>
+        <w:rPr>
+          <w:rFonts w:eastAsia="Times New Roman" w:cs="Times New Roman"/>
+          <w:szCs w:val="28"/>
+        </w:rPr>
+        <w:t xml:space="preserve">Глобальная обработка ошибок в </w:t>
+      </w:r>
+      <w:r>
+        <w:rPr>
+          <w:rFonts w:eastAsia="Times New Roman" w:cs="Times New Roman"/>
+          <w:i/>
+          <w:iCs/>
+          <w:szCs w:val="28"/>
+        </w:rPr>
+        <w:t>Express</w:t>
+      </w:r>
+      <w:r>
+        <w:rPr>
+          <w:rFonts w:eastAsia="Times New Roman" w:cs="Times New Roman"/>
+          <w:szCs w:val="28"/>
+        </w:rPr>
+        <w:t xml:space="preserve"> организуется через </w:t>
+      </w:r>
+      <w:proofErr w:type="spellStart"/>
+      <w:r>
+        <w:rPr>
+          <w:rFonts w:eastAsia="Times New Roman" w:cs="Times New Roman"/>
+          <w:i/>
+          <w:iCs/>
+          <w:szCs w:val="28"/>
+        </w:rPr>
+        <w:t>middleware</w:t>
+      </w:r>
+      <w:proofErr w:type="spellEnd"/>
+      <w:r>
+        <w:rPr>
+          <w:rFonts w:eastAsia="Times New Roman" w:cs="Times New Roman"/>
+          <w:szCs w:val="28"/>
+        </w:rPr>
+        <w:t xml:space="preserve"> с четырьмя параметрами </w:t>
+      </w:r>
+      <w:proofErr w:type="gramStart"/>
+      <w:r>
+        <w:rPr>
+          <w:rFonts w:eastAsia="Times New Roman" w:cs="Times New Roman"/>
+          <w:szCs w:val="28"/>
+        </w:rPr>
+        <w:t>`(</w:t>
+      </w:r>
+      <w:proofErr w:type="spellStart"/>
+      <w:proofErr w:type="gramEnd"/>
+      <w:r>
+        <w:rPr>
+          <w:rFonts w:eastAsia="Times New Roman" w:cs="Times New Roman"/>
+          <w:i/>
+          <w:iCs/>
+          <w:szCs w:val="28"/>
+        </w:rPr>
+        <w:t>err</w:t>
+      </w:r>
+      <w:proofErr w:type="spellEnd"/>
+      <w:r>
+        <w:rPr>
+          <w:rFonts w:eastAsia="Times New Roman" w:cs="Times New Roman"/>
+          <w:szCs w:val="28"/>
+        </w:rPr>
+        <w:t xml:space="preserve">, </w:t>
+      </w:r>
+      <w:proofErr w:type="spellStart"/>
+      <w:r>
+        <w:rPr>
+          <w:rFonts w:eastAsia="Times New Roman" w:cs="Times New Roman"/>
+          <w:i/>
+          <w:iCs/>
+          <w:szCs w:val="28"/>
+        </w:rPr>
+        <w:t>req</w:t>
+      </w:r>
+      <w:proofErr w:type="spellEnd"/>
+      <w:r>
+        <w:rPr>
+          <w:rFonts w:eastAsia="Times New Roman" w:cs="Times New Roman"/>
+          <w:szCs w:val="28"/>
+        </w:rPr>
+        <w:t xml:space="preserve">, </w:t>
+      </w:r>
+      <w:proofErr w:type="spellStart"/>
+      <w:r>
+        <w:rPr>
+          <w:rFonts w:eastAsia="Times New Roman" w:cs="Times New Roman"/>
+          <w:i/>
+          <w:iCs/>
+          <w:szCs w:val="28"/>
+        </w:rPr>
+        <w:t>res</w:t>
+      </w:r>
+      <w:proofErr w:type="spellEnd"/>
+      <w:r>
+        <w:rPr>
+          <w:rFonts w:eastAsia="Times New Roman" w:cs="Times New Roman"/>
+          <w:szCs w:val="28"/>
+        </w:rPr>
+        <w:t xml:space="preserve">, </w:t>
+      </w:r>
+      <w:proofErr w:type="spellStart"/>
+      <w:r>
+        <w:rPr>
+          <w:rFonts w:eastAsia="Times New Roman" w:cs="Times New Roman"/>
+          <w:i/>
+          <w:iCs/>
+          <w:szCs w:val="28"/>
+        </w:rPr>
+        <w:t>next</w:t>
+      </w:r>
+      <w:proofErr w:type="spellEnd"/>
+      <w:r>
+        <w:rPr>
+          <w:rFonts w:eastAsia="Times New Roman" w:cs="Times New Roman"/>
+          <w:szCs w:val="28"/>
+        </w:rPr>
+        <w:t>)`, которое подключается после всех маршрутов через `</w:t>
+      </w:r>
+      <w:proofErr w:type="spellStart"/>
+      <w:r>
+        <w:rPr>
+          <w:rFonts w:eastAsia="Times New Roman" w:cs="Times New Roman"/>
+          <w:szCs w:val="28"/>
+        </w:rPr>
+        <w:t>app.use</w:t>
+      </w:r>
+      <w:proofErr w:type="spellEnd"/>
+      <w:r>
+        <w:rPr>
+          <w:rFonts w:eastAsia="Times New Roman" w:cs="Times New Roman"/>
+          <w:szCs w:val="28"/>
+        </w:rPr>
+        <w:t>(</w:t>
+      </w:r>
+      <w:proofErr w:type="spellStart"/>
+      <w:r>
+        <w:rPr>
+          <w:rFonts w:eastAsia="Times New Roman" w:cs="Times New Roman"/>
+          <w:i/>
+          <w:iCs/>
+          <w:szCs w:val="28"/>
+        </w:rPr>
+        <w:t>errorHandler</w:t>
+      </w:r>
+      <w:proofErr w:type="spellEnd"/>
+      <w:r>
+        <w:rPr>
+          <w:rFonts w:eastAsia="Times New Roman" w:cs="Times New Roman"/>
+          <w:szCs w:val="28"/>
+        </w:rPr>
+        <w:t xml:space="preserve">)` и перехватывает все необработанные ошибки, возвращая статус 500 и </w:t>
+      </w:r>
+      <w:r>
+        <w:rPr>
+          <w:rFonts w:eastAsia="Times New Roman" w:cs="Times New Roman"/>
+          <w:i/>
+          <w:iCs/>
+          <w:szCs w:val="28"/>
+        </w:rPr>
+        <w:t>JSON</w:t>
+      </w:r>
+      <w:r>
+        <w:rPr>
+          <w:rFonts w:eastAsia="Times New Roman" w:cs="Times New Roman"/>
+          <w:szCs w:val="28"/>
+        </w:rPr>
+        <w:t xml:space="preserve"> с сообщением.</w:t>
+      </w:r>
+    </w:p>
+    <w:p>
+      <w:pPr>
+        <w:spacing w:after="0" w:line="360" w:lineRule="exact"/>
+        <w:rPr>
+          <w:rFonts w:eastAsia="Times New Roman" w:cs="Times New Roman"/>
+          <w:szCs w:val="28"/>
+        </w:rPr>
+      </w:pPr>
+      <w:r>
+        <w:rPr>
+          <w:rFonts w:eastAsia="Times New Roman" w:cs="Times New Roman"/>
+          <w:szCs w:val="28"/>
+        </w:rPr>
+        <w:t xml:space="preserve">Для ошибок мы выбрали структуру ответа </w:t>
+      </w:r>
+      <w:proofErr w:type="gramStart"/>
+      <w:r>
+        <w:rPr>
+          <w:rFonts w:eastAsia="Times New Roman" w:cs="Times New Roman"/>
+          <w:szCs w:val="28"/>
+        </w:rPr>
+        <w:t xml:space="preserve">`{ </w:t>
+      </w:r>
+      <w:proofErr w:type="spellStart"/>
+      <w:r>
+        <w:rPr>
+          <w:rFonts w:eastAsia="Times New Roman" w:cs="Times New Roman"/>
+          <w:i/>
+          <w:iCs/>
+          <w:szCs w:val="28"/>
+        </w:rPr>
+        <w:t>error</w:t>
+      </w:r>
+      <w:proofErr w:type="spellEnd"/>
+      <w:proofErr w:type="gramEnd"/>
+      <w:r>
+        <w:rPr>
+          <w:rFonts w:eastAsia="Times New Roman" w:cs="Times New Roman"/>
+          <w:szCs w:val="28"/>
+        </w:rPr>
+        <w:t>: "сообщение" }`, например `{ "</w:t>
+      </w:r>
+      <w:proofErr w:type="spellStart"/>
+      <w:r>
+        <w:rPr>
+          <w:rFonts w:eastAsia="Times New Roman" w:cs="Times New Roman"/>
+          <w:i/>
+          <w:iCs/>
+          <w:szCs w:val="28"/>
+        </w:rPr>
+        <w:t>error</w:t>
+      </w:r>
+      <w:proofErr w:type="spellEnd"/>
+      <w:r>
+        <w:rPr>
+          <w:rFonts w:eastAsia="Times New Roman" w:cs="Times New Roman"/>
+          <w:szCs w:val="28"/>
+        </w:rPr>
+        <w:t>": "Баг с таким ID не найден" }` при 404 или `{ "</w:t>
+      </w:r>
+      <w:proofErr w:type="spellStart"/>
+      <w:r>
+        <w:rPr>
+          <w:rFonts w:eastAsia="Times New Roman" w:cs="Times New Roman"/>
+          <w:i/>
+          <w:iCs/>
+          <w:szCs w:val="28"/>
+        </w:rPr>
+        <w:t>error</w:t>
+      </w:r>
+      <w:proofErr w:type="spellEnd"/>
+      <w:r>
+        <w:rPr>
+          <w:rFonts w:eastAsia="Times New Roman" w:cs="Times New Roman"/>
+          <w:szCs w:val="28"/>
+        </w:rPr>
+        <w:t>": "Поле \"</w:t>
+      </w:r>
+      <w:proofErr w:type="spellStart"/>
+      <w:r>
+        <w:rPr>
+          <w:rFonts w:eastAsia="Times New Roman" w:cs="Times New Roman"/>
+          <w:i/>
+          <w:iCs/>
+          <w:szCs w:val="28"/>
+        </w:rPr>
+        <w:t>title</w:t>
+      </w:r>
+      <w:proofErr w:type="spellEnd"/>
+      <w:r>
+        <w:rPr>
+          <w:rFonts w:eastAsia="Times New Roman" w:cs="Times New Roman"/>
+          <w:szCs w:val="28"/>
+        </w:rPr>
+        <w:t>\" (название) обязательно" }` при 400.</w:t>
+      </w:r>
+    </w:p>
+    <w:p>
+      <w:pPr>
+        <w:spacing w:after="0" w:line="360" w:lineRule="exact"/>
+        <w:rPr>
+          <w:rFonts w:eastAsia="Times New Roman" w:cs="Times New Roman"/>
+          <w:szCs w:val="28"/>
+        </w:rPr>
+      </w:pPr>
+      <w:r>
+        <w:rPr>
+          <w:rFonts w:eastAsia="Times New Roman" w:cs="Times New Roman"/>
+          <w:szCs w:val="28"/>
+        </w:rPr>
+        <w:t xml:space="preserve">Если попытаться удалить уже удалённый ресурс через </w:t>
+      </w:r>
+      <w:r>
+        <w:rPr>
+          <w:rFonts w:eastAsia="Times New Roman" w:cs="Times New Roman"/>
+          <w:i/>
+          <w:iCs/>
+          <w:szCs w:val="28"/>
+        </w:rPr>
+        <w:t>DELETE</w:t>
+      </w:r>
+      <w:r>
+        <w:rPr>
+          <w:rFonts w:eastAsia="Times New Roman" w:cs="Times New Roman"/>
+          <w:szCs w:val="28"/>
+        </w:rPr>
+        <w:t xml:space="preserve">, сервер вернёт статус 404 </w:t>
+      </w:r>
+      <w:proofErr w:type="spellStart"/>
+      <w:r>
+        <w:rPr>
+          <w:rFonts w:eastAsia="Times New Roman" w:cs="Times New Roman"/>
+          <w:i/>
+          <w:iCs/>
+          <w:szCs w:val="28"/>
+        </w:rPr>
+        <w:t>Not</w:t>
+      </w:r>
+      <w:proofErr w:type="spellEnd"/>
+      <w:r>
+        <w:rPr>
+          <w:rFonts w:eastAsia="Times New Roman" w:cs="Times New Roman"/>
+          <w:i/>
+          <w:iCs/>
+          <w:szCs w:val="28"/>
+        </w:rPr>
+        <w:t xml:space="preserve"> </w:t>
+      </w:r>
+      <w:proofErr w:type="spellStart"/>
+      <w:r>
+        <w:rPr>
+          <w:rFonts w:eastAsia="Times New Roman" w:cs="Times New Roman"/>
+          <w:i/>
+          <w:iCs/>
+          <w:szCs w:val="28"/>
+        </w:rPr>
+        <w:t>Foun</w:t>
+      </w:r>
+      <w:r>
+        <w:rPr>
+          <w:rFonts w:eastAsia="Times New Roman" w:cs="Times New Roman"/>
+          <w:szCs w:val="28"/>
+        </w:rPr>
+        <w:t>d</w:t>
+      </w:r>
+      <w:proofErr w:type="spellEnd"/>
+      <w:r>
+        <w:rPr>
+          <w:rFonts w:eastAsia="Times New Roman" w:cs="Times New Roman"/>
+          <w:szCs w:val="28"/>
+        </w:rPr>
+        <w:t xml:space="preserve"> с сообщением </w:t>
+      </w:r>
+      <w:proofErr w:type="gramStart"/>
+      <w:r>
+        <w:rPr>
+          <w:rFonts w:eastAsia="Times New Roman" w:cs="Times New Roman"/>
+          <w:szCs w:val="28"/>
+        </w:rPr>
+        <w:t>`{ "</w:t>
+      </w:r>
+      <w:proofErr w:type="spellStart"/>
+      <w:proofErr w:type="gramEnd"/>
+      <w:r>
+        <w:rPr>
+          <w:rFonts w:eastAsia="Times New Roman" w:cs="Times New Roman"/>
+          <w:i/>
+          <w:iCs/>
+          <w:szCs w:val="28"/>
+        </w:rPr>
+        <w:t>error</w:t>
+      </w:r>
+      <w:proofErr w:type="spellEnd"/>
+      <w:r>
+        <w:rPr>
+          <w:rFonts w:eastAsia="Times New Roman" w:cs="Times New Roman"/>
+          <w:szCs w:val="28"/>
+        </w:rPr>
+        <w:t xml:space="preserve">": "Баг с таким </w:t>
+      </w:r>
+      <w:r>
+        <w:rPr>
+          <w:rFonts w:eastAsia="Times New Roman" w:cs="Times New Roman"/>
+          <w:i/>
+          <w:iCs/>
+          <w:szCs w:val="28"/>
+        </w:rPr>
+        <w:t>ID</w:t>
+      </w:r>
+      <w:r>
+        <w:rPr>
+          <w:rFonts w:eastAsia="Times New Roman" w:cs="Times New Roman"/>
+          <w:szCs w:val="28"/>
+        </w:rPr>
+        <w:t xml:space="preserve"> не найден" }`, так как модель не найдёт элемент в массиве.</w:t>
+      </w:r>
+    </w:p>
+    <w:p>
+      <w:pPr>
+        <w:spacing w:after="0" w:line="360" w:lineRule="exact"/>
+        <w:rPr>
+          <w:rFonts w:eastAsia="Times New Roman" w:cs="Times New Roman"/>
+          <w:szCs w:val="28"/>
+        </w:rPr>
+      </w:pPr>
+      <w:proofErr w:type="spellStart"/>
+      <w:r>
+        <w:rPr>
+          <w:rFonts w:eastAsia="Times New Roman" w:cs="Times New Roman"/>
+          <w:i/>
+          <w:iCs/>
+          <w:szCs w:val="28"/>
+        </w:rPr>
+        <w:t>Nodemon</w:t>
+      </w:r>
+      <w:proofErr w:type="spellEnd"/>
+      <w:r>
+        <w:rPr>
+          <w:rFonts w:eastAsia="Times New Roman" w:cs="Times New Roman"/>
+          <w:i/>
+          <w:iCs/>
+          <w:szCs w:val="28"/>
+        </w:rPr>
+        <w:t xml:space="preserve"> </w:t>
+      </w:r>
+      <w:r>
+        <w:rPr>
+          <w:rFonts w:eastAsia="Times New Roman" w:cs="Times New Roman"/>
+          <w:szCs w:val="28"/>
+        </w:rPr>
+        <w:t>даёт огромное преимущество в разработке: он автоматически перезапускает сервер при каждом изменении файлов, что избавляет от необходимости вручную останавливать и запускать сервер после каждой правки кода.</w:t>
+      </w:r>
+    </w:p>
+    <w:p>
+      <w:pPr>
+        <w:spacing w:after="0" w:line="360" w:lineRule="exact"/>
+        <w:rPr>
+          <w:rFonts w:eastAsia="Times New Roman" w:cs="Times New Roman"/>
+          <w:szCs w:val="28"/>
+        </w:rPr>
+      </w:pPr>
+      <w:r>
+        <w:rPr>
+          <w:rFonts w:eastAsia="Times New Roman" w:cs="Times New Roman"/>
+          <w:szCs w:val="28"/>
+        </w:rPr>
+        <w:lastRenderedPageBreak/>
+        <w:t xml:space="preserve">Разница между </w:t>
+      </w:r>
+      <w:r>
+        <w:rPr>
+          <w:rFonts w:eastAsia="Times New Roman" w:cs="Times New Roman"/>
+          <w:i/>
+          <w:iCs/>
+          <w:szCs w:val="28"/>
+        </w:rPr>
+        <w:t>PUT</w:t>
+      </w:r>
+      <w:r>
+        <w:rPr>
+          <w:rFonts w:eastAsia="Times New Roman" w:cs="Times New Roman"/>
+          <w:szCs w:val="28"/>
+        </w:rPr>
+        <w:t xml:space="preserve"> и </w:t>
+      </w:r>
+      <w:r>
+        <w:rPr>
+          <w:rFonts w:eastAsia="Times New Roman" w:cs="Times New Roman"/>
+          <w:i/>
+          <w:iCs/>
+          <w:szCs w:val="28"/>
+        </w:rPr>
+        <w:t>PATCH</w:t>
+      </w:r>
+      <w:r>
+        <w:rPr>
+          <w:rFonts w:eastAsia="Times New Roman" w:cs="Times New Roman"/>
+          <w:szCs w:val="28"/>
+        </w:rPr>
+        <w:t xml:space="preserve"> заключается в том, что </w:t>
+      </w:r>
+      <w:r>
+        <w:rPr>
+          <w:rFonts w:eastAsia="Times New Roman" w:cs="Times New Roman"/>
+          <w:i/>
+          <w:iCs/>
+          <w:szCs w:val="28"/>
+        </w:rPr>
+        <w:t>PUT</w:t>
+      </w:r>
+      <w:r>
+        <w:rPr>
+          <w:rFonts w:eastAsia="Times New Roman" w:cs="Times New Roman"/>
+          <w:szCs w:val="28"/>
+        </w:rPr>
+        <w:t xml:space="preserve"> полностью заменяет ресурс (требует передачи всех полей), а </w:t>
+      </w:r>
+      <w:r>
+        <w:rPr>
+          <w:rFonts w:eastAsia="Times New Roman" w:cs="Times New Roman"/>
+          <w:i/>
+          <w:iCs/>
+          <w:szCs w:val="28"/>
+        </w:rPr>
+        <w:t>PATCH</w:t>
+      </w:r>
+      <w:r>
+        <w:rPr>
+          <w:rFonts w:eastAsia="Times New Roman" w:cs="Times New Roman"/>
+          <w:szCs w:val="28"/>
+        </w:rPr>
+        <w:t xml:space="preserve"> частично обновляет только указанные поля; мы реализовали PUT, так как по заданию лабораторной работы требуется полное обновление элемента.</w:t>
+      </w:r>
+    </w:p>
+    <w:p>
+      <w:pPr>
+        <w:spacing w:after="0" w:line="360" w:lineRule="exact"/>
+        <w:rPr>
+          <w:rFonts w:eastAsia="Times New Roman" w:cs="Times New Roman"/>
+          <w:szCs w:val="28"/>
+        </w:rPr>
+      </w:pPr>
+      <w:r>
+        <w:rPr>
+          <w:rFonts w:eastAsia="Times New Roman" w:cs="Times New Roman"/>
+          <w:szCs w:val="28"/>
+        </w:rPr>
+        <w:t>Для добавления поддержки CORS теоретически нужно установить пакет `</w:t>
+      </w:r>
+      <w:proofErr w:type="spellStart"/>
+      <w:r>
+        <w:rPr>
+          <w:rFonts w:eastAsia="Times New Roman" w:cs="Times New Roman"/>
+          <w:i/>
+          <w:iCs/>
+          <w:szCs w:val="28"/>
+        </w:rPr>
+        <w:t>cors</w:t>
+      </w:r>
+      <w:proofErr w:type="spellEnd"/>
+      <w:r>
+        <w:rPr>
+          <w:rFonts w:eastAsia="Times New Roman" w:cs="Times New Roman"/>
+          <w:szCs w:val="28"/>
+        </w:rPr>
+        <w:t>` (`</w:t>
+      </w:r>
+      <w:proofErr w:type="spellStart"/>
+      <w:r>
+        <w:rPr>
+          <w:rFonts w:eastAsia="Times New Roman" w:cs="Times New Roman"/>
+          <w:i/>
+          <w:iCs/>
+          <w:szCs w:val="28"/>
+        </w:rPr>
+        <w:t>npm</w:t>
+      </w:r>
+      <w:proofErr w:type="spellEnd"/>
+      <w:r>
+        <w:rPr>
+          <w:rFonts w:eastAsia="Times New Roman" w:cs="Times New Roman"/>
+          <w:i/>
+          <w:iCs/>
+          <w:szCs w:val="28"/>
+        </w:rPr>
+        <w:t xml:space="preserve"> </w:t>
+      </w:r>
+      <w:proofErr w:type="spellStart"/>
+      <w:r>
+        <w:rPr>
+          <w:rFonts w:eastAsia="Times New Roman" w:cs="Times New Roman"/>
+          <w:i/>
+          <w:iCs/>
+          <w:szCs w:val="28"/>
+        </w:rPr>
+        <w:t>install</w:t>
+      </w:r>
+      <w:proofErr w:type="spellEnd"/>
+      <w:r>
+        <w:rPr>
+          <w:rFonts w:eastAsia="Times New Roman" w:cs="Times New Roman"/>
+          <w:i/>
+          <w:iCs/>
+          <w:szCs w:val="28"/>
+        </w:rPr>
+        <w:t xml:space="preserve"> </w:t>
+      </w:r>
+      <w:proofErr w:type="spellStart"/>
+      <w:r>
+        <w:rPr>
+          <w:rFonts w:eastAsia="Times New Roman" w:cs="Times New Roman"/>
+          <w:i/>
+          <w:iCs/>
+          <w:szCs w:val="28"/>
+        </w:rPr>
+        <w:t>cors</w:t>
+      </w:r>
+      <w:proofErr w:type="spellEnd"/>
+      <w:r>
+        <w:rPr>
+          <w:rFonts w:eastAsia="Times New Roman" w:cs="Times New Roman"/>
+          <w:szCs w:val="28"/>
+        </w:rPr>
+        <w:t xml:space="preserve">`) и подключить его как </w:t>
+      </w:r>
+      <w:proofErr w:type="spellStart"/>
+      <w:r>
+        <w:rPr>
+          <w:rFonts w:eastAsia="Times New Roman" w:cs="Times New Roman"/>
+          <w:i/>
+          <w:iCs/>
+          <w:szCs w:val="28"/>
+        </w:rPr>
+        <w:t>middleware</w:t>
+      </w:r>
+      <w:proofErr w:type="spellEnd"/>
+      <w:r>
+        <w:rPr>
+          <w:rFonts w:eastAsia="Times New Roman" w:cs="Times New Roman"/>
+          <w:szCs w:val="28"/>
+        </w:rPr>
+        <w:t>: `</w:t>
+      </w:r>
+      <w:proofErr w:type="spellStart"/>
+      <w:r>
+        <w:rPr>
+          <w:rFonts w:eastAsia="Times New Roman" w:cs="Times New Roman"/>
+          <w:i/>
+          <w:iCs/>
+          <w:szCs w:val="28"/>
+        </w:rPr>
+        <w:t>app.use</w:t>
+      </w:r>
+      <w:proofErr w:type="spellEnd"/>
+      <w:r>
+        <w:rPr>
+          <w:rFonts w:eastAsia="Times New Roman" w:cs="Times New Roman"/>
+          <w:i/>
+          <w:iCs/>
+          <w:szCs w:val="28"/>
+        </w:rPr>
+        <w:t>(</w:t>
+      </w:r>
+      <w:proofErr w:type="spellStart"/>
+      <w:proofErr w:type="gramStart"/>
+      <w:r>
+        <w:rPr>
+          <w:rFonts w:eastAsia="Times New Roman" w:cs="Times New Roman"/>
+          <w:i/>
+          <w:iCs/>
+          <w:szCs w:val="28"/>
+        </w:rPr>
+        <w:t>cors</w:t>
+      </w:r>
+      <w:proofErr w:type="spellEnd"/>
+      <w:r>
+        <w:rPr>
+          <w:rFonts w:eastAsia="Times New Roman" w:cs="Times New Roman"/>
+          <w:szCs w:val="28"/>
+        </w:rPr>
+        <w:t>(</w:t>
+      </w:r>
+      <w:proofErr w:type="gramEnd"/>
+      <w:r>
+        <w:rPr>
+          <w:rFonts w:eastAsia="Times New Roman" w:cs="Times New Roman"/>
+          <w:szCs w:val="28"/>
+        </w:rPr>
+        <w:t>))`, что позволит браузеру делать запросы с других доменов.</w:t>
+      </w:r>
+    </w:p>
+    <w:p>
+      <w:pPr>
+        <w:spacing w:after="0" w:line="360" w:lineRule="exact"/>
+        <w:rPr>
+          <w:rFonts w:eastAsia="Times New Roman" w:cs="Times New Roman"/>
+          <w:szCs w:val="28"/>
+        </w:rPr>
+      </w:pPr>
+      <w:r>
+        <w:rPr>
+          <w:rFonts w:eastAsia="Times New Roman" w:cs="Times New Roman"/>
+          <w:szCs w:val="28"/>
+        </w:rPr>
+        <w:t xml:space="preserve">Данные хранятся в массиве, потому что это первая лабораторная работа, цель которой — изучить основы </w:t>
+      </w:r>
+      <w:r>
+        <w:rPr>
+          <w:rFonts w:eastAsia="Times New Roman" w:cs="Times New Roman"/>
+          <w:i/>
+          <w:iCs/>
+          <w:szCs w:val="28"/>
+        </w:rPr>
+        <w:t>Express</w:t>
+      </w:r>
+      <w:r>
+        <w:rPr>
+          <w:rFonts w:eastAsia="Times New Roman" w:cs="Times New Roman"/>
+          <w:szCs w:val="28"/>
+        </w:rPr>
+        <w:t xml:space="preserve"> и маршрутизации без усложнения; переход на базу данных стоит делать, когда требуется постоянное хранение данных, работа с большими объёмами, многопользовательский доступ и сложные запросы.</w:t>
+      </w:r>
+    </w:p>
+    <w:p>
+      <w:pPr>
+        <w:spacing w:after="0" w:line="360" w:lineRule="exact"/>
+        <w:rPr>
+          <w:rFonts w:eastAsia="Times New Roman" w:cs="Times New Roman"/>
+          <w:szCs w:val="28"/>
+        </w:rPr>
+      </w:pPr>
+      <w:r>
+        <w:rPr>
+          <w:rFonts w:eastAsia="Times New Roman" w:cs="Times New Roman"/>
+          <w:szCs w:val="28"/>
+        </w:rPr>
+        <w:t>Для отправки JSON-данных должен быть установлен заголовок `</w:t>
+      </w:r>
+      <w:r>
+        <w:rPr>
+          <w:rFonts w:eastAsia="Times New Roman" w:cs="Times New Roman"/>
+          <w:i/>
+          <w:iCs/>
+          <w:szCs w:val="28"/>
+        </w:rPr>
+        <w:t>Content</w:t>
+      </w:r>
+      <w:r>
+        <w:rPr>
+          <w:rFonts w:eastAsia="Times New Roman" w:cs="Times New Roman"/>
+          <w:szCs w:val="28"/>
+        </w:rPr>
+        <w:t>-</w:t>
+      </w:r>
+      <w:r>
+        <w:rPr>
+          <w:rFonts w:eastAsia="Times New Roman" w:cs="Times New Roman"/>
+          <w:i/>
+          <w:iCs/>
+          <w:szCs w:val="28"/>
+        </w:rPr>
+        <w:t>Type</w:t>
+      </w:r>
+      <w:r>
+        <w:rPr>
+          <w:rFonts w:eastAsia="Times New Roman" w:cs="Times New Roman"/>
+          <w:szCs w:val="28"/>
+        </w:rPr>
+        <w:t xml:space="preserve">: </w:t>
+      </w:r>
+      <w:proofErr w:type="spellStart"/>
+      <w:r>
+        <w:rPr>
+          <w:rFonts w:eastAsia="Times New Roman" w:cs="Times New Roman"/>
+          <w:i/>
+          <w:iCs/>
+          <w:szCs w:val="28"/>
+        </w:rPr>
+        <w:t>application</w:t>
+      </w:r>
+      <w:proofErr w:type="spellEnd"/>
+      <w:r>
+        <w:rPr>
+          <w:rFonts w:eastAsia="Times New Roman" w:cs="Times New Roman"/>
+          <w:i/>
+          <w:iCs/>
+          <w:szCs w:val="28"/>
+        </w:rPr>
+        <w:t>/</w:t>
+      </w:r>
+      <w:proofErr w:type="spellStart"/>
+      <w:r>
+        <w:rPr>
+          <w:rFonts w:eastAsia="Times New Roman" w:cs="Times New Roman"/>
+          <w:i/>
+          <w:iCs/>
+          <w:szCs w:val="28"/>
+        </w:rPr>
+        <w:t>json</w:t>
+      </w:r>
+      <w:proofErr w:type="spellEnd"/>
+      <w:r>
+        <w:rPr>
+          <w:rFonts w:eastAsia="Times New Roman" w:cs="Times New Roman"/>
+          <w:szCs w:val="28"/>
+        </w:rPr>
+        <w:t>`.</w:t>
+      </w:r>
+    </w:p>
+    <w:p>
+      <w:pPr>
+        <w:spacing w:after="0" w:line="360" w:lineRule="exact"/>
+        <w:rPr>
+          <w:rFonts w:eastAsia="Times New Roman" w:cs="Times New Roman"/>
+          <w:i/>
+          <w:iCs/>
+          <w:szCs w:val="28"/>
+        </w:rPr>
+      </w:pPr>
+      <w:r>
+        <w:rPr>
+          <w:rFonts w:eastAsia="Times New Roman" w:cs="Times New Roman"/>
+          <w:szCs w:val="28"/>
+        </w:rPr>
+        <w:t xml:space="preserve">Пример </w:t>
+      </w:r>
+      <w:proofErr w:type="spellStart"/>
+      <w:r>
+        <w:rPr>
+          <w:rFonts w:eastAsia="Times New Roman" w:cs="Times New Roman"/>
+          <w:i/>
+          <w:iCs/>
+          <w:szCs w:val="28"/>
+        </w:rPr>
+        <w:t>curl</w:t>
+      </w:r>
+      <w:proofErr w:type="spellEnd"/>
+      <w:r>
+        <w:rPr>
+          <w:rFonts w:eastAsia="Times New Roman" w:cs="Times New Roman"/>
+          <w:szCs w:val="28"/>
+        </w:rPr>
+        <w:t xml:space="preserve">-команды для тестирования </w:t>
+      </w:r>
+      <w:r>
+        <w:rPr>
+          <w:rFonts w:eastAsia="Times New Roman" w:cs="Times New Roman"/>
+          <w:i/>
+          <w:iCs/>
+          <w:szCs w:val="28"/>
+        </w:rPr>
+        <w:t>POST</w:t>
+      </w:r>
+      <w:r>
+        <w:rPr>
+          <w:rFonts w:eastAsia="Times New Roman" w:cs="Times New Roman"/>
+          <w:szCs w:val="28"/>
+        </w:rPr>
+        <w:t>-</w:t>
+      </w:r>
+      <w:proofErr w:type="spellStart"/>
+      <w:r>
+        <w:rPr>
+          <w:rFonts w:eastAsia="Times New Roman" w:cs="Times New Roman"/>
+          <w:szCs w:val="28"/>
+        </w:rPr>
+        <w:t>эндпоинта</w:t>
+      </w:r>
+      <w:proofErr w:type="spellEnd"/>
+      <w:r>
+        <w:rPr>
+          <w:rFonts w:eastAsia="Times New Roman" w:cs="Times New Roman"/>
+          <w:szCs w:val="28"/>
+        </w:rPr>
+        <w:t>: `</w:t>
+      </w:r>
+      <w:proofErr w:type="spellStart"/>
+      <w:r>
+        <w:rPr>
+          <w:rFonts w:eastAsia="Times New Roman" w:cs="Times New Roman"/>
+          <w:i/>
+          <w:iCs/>
+          <w:szCs w:val="28"/>
+        </w:rPr>
+        <w:t>curl</w:t>
+      </w:r>
+      <w:proofErr w:type="spellEnd"/>
+      <w:r>
+        <w:rPr>
+          <w:rFonts w:eastAsia="Times New Roman" w:cs="Times New Roman"/>
+          <w:szCs w:val="28"/>
+        </w:rPr>
+        <w:t xml:space="preserve"> -</w:t>
+      </w:r>
+      <w:r>
+        <w:rPr>
+          <w:rFonts w:eastAsia="Times New Roman" w:cs="Times New Roman"/>
+          <w:i/>
+          <w:iCs/>
+          <w:szCs w:val="28"/>
+        </w:rPr>
+        <w:t>X POST</w:t>
+      </w:r>
+      <w:r>
+        <w:rPr>
+          <w:rFonts w:eastAsia="Times New Roman" w:cs="Times New Roman"/>
+          <w:szCs w:val="28"/>
+        </w:rPr>
+        <w:t xml:space="preserve"> </w:t>
+      </w:r>
+      <w:r>
+        <w:rPr>
+          <w:rFonts w:eastAsia="Times New Roman" w:cs="Times New Roman"/>
+          <w:i/>
+          <w:iCs/>
+          <w:szCs w:val="28"/>
+        </w:rPr>
+        <w:t>http://localhost:3000/</w:t>
+      </w:r>
+      <w:r>
+        <w:rPr>
+          <w:rFonts w:eastAsia="Times New Roman" w:cs="Times New Roman"/>
+          <w:i/>
+          <w:iCs/>
+          <w:szCs w:val="28"/>
+          <w:lang w:val="en-US"/>
+        </w:rPr>
+        <w:t>items</w:t>
+      </w:r>
+      <w:r>
+        <w:rPr>
+          <w:rFonts w:eastAsia="Times New Roman" w:cs="Times New Roman"/>
+          <w:i/>
+          <w:iCs/>
+          <w:szCs w:val="28"/>
+        </w:rPr>
+        <w:t xml:space="preserve"> </w:t>
+      </w:r>
+      <w:r>
+        <w:rPr>
+          <w:rFonts w:eastAsia="Times New Roman" w:cs="Times New Roman"/>
+          <w:i/>
+          <w:iCs/>
+          <w:szCs w:val="28"/>
+        </w:rPr>
+        <w:t xml:space="preserve">-H "Content-Type: </w:t>
+      </w:r>
+      <w:proofErr w:type="spellStart"/>
+      <w:r>
+        <w:rPr>
+          <w:rFonts w:eastAsia="Times New Roman" w:cs="Times New Roman"/>
+          <w:i/>
+          <w:iCs/>
+          <w:szCs w:val="28"/>
+        </w:rPr>
+        <w:t>application</w:t>
+      </w:r>
+      <w:proofErr w:type="spellEnd"/>
+      <w:r>
+        <w:rPr>
+          <w:rFonts w:eastAsia="Times New Roman" w:cs="Times New Roman"/>
+          <w:i/>
+          <w:iCs/>
+          <w:szCs w:val="28"/>
+        </w:rPr>
+        <w:t>/</w:t>
+      </w:r>
+      <w:proofErr w:type="spellStart"/>
+      <w:r>
+        <w:rPr>
+          <w:rFonts w:eastAsia="Times New Roman" w:cs="Times New Roman"/>
+          <w:i/>
+          <w:iCs/>
+          <w:szCs w:val="28"/>
+        </w:rPr>
+        <w:t>json</w:t>
+      </w:r>
+      <w:proofErr w:type="spellEnd"/>
+      <w:r>
+        <w:rPr>
+          <w:rFonts w:eastAsia="Times New Roman" w:cs="Times New Roman"/>
+          <w:i/>
+          <w:iCs/>
+          <w:szCs w:val="28"/>
+        </w:rPr>
+        <w:t>" -d "{\"</w:t>
+      </w:r>
+      <w:proofErr w:type="spellStart"/>
+      <w:r>
+        <w:rPr>
+          <w:rFonts w:eastAsia="Times New Roman" w:cs="Times New Roman"/>
+          <w:i/>
+          <w:iCs/>
+          <w:szCs w:val="28"/>
+        </w:rPr>
+        <w:t>title</w:t>
+      </w:r>
+      <w:proofErr w:type="spellEnd"/>
+      <w:r>
+        <w:rPr>
+          <w:rFonts w:eastAsia="Times New Roman" w:cs="Times New Roman"/>
+          <w:i/>
+          <w:iCs/>
+          <w:szCs w:val="28"/>
+        </w:rPr>
+        <w:t>\</w:t>
+      </w:r>
+      <w:proofErr w:type="gramStart"/>
+      <w:r>
+        <w:rPr>
+          <w:rFonts w:eastAsia="Times New Roman" w:cs="Times New Roman"/>
+          <w:i/>
+          <w:iCs/>
+          <w:szCs w:val="28"/>
+        </w:rPr>
+        <w:t>":\</w:t>
+      </w:r>
+      <w:proofErr w:type="gramEnd"/>
+      <w:r>
+        <w:rPr>
+          <w:rFonts w:eastAsia="Times New Roman" w:cs="Times New Roman"/>
+          <w:i/>
+          <w:iCs/>
+          <w:szCs w:val="28"/>
+        </w:rPr>
+        <w:t>"Новый баг\",\"</w:t>
+      </w:r>
+      <w:proofErr w:type="spellStart"/>
+      <w:r>
+        <w:rPr>
+          <w:rFonts w:eastAsia="Times New Roman" w:cs="Times New Roman"/>
+          <w:i/>
+          <w:iCs/>
+          <w:szCs w:val="28"/>
+        </w:rPr>
+        <w:t>priority</w:t>
+      </w:r>
+      <w:proofErr w:type="spellEnd"/>
+      <w:r>
+        <w:rPr>
+          <w:rFonts w:eastAsia="Times New Roman" w:cs="Times New Roman"/>
+          <w:i/>
+          <w:iCs/>
+          <w:szCs w:val="28"/>
+        </w:rPr>
+        <w:t>\":\"Высокий\"}"`.</w:t>
+      </w:r>
+    </w:p>
+    <w:p>
+      <w:pPr>
+        <w:spacing w:after="0" w:line="360" w:lineRule="exact"/>
+        <w:rPr>
+          <w:rFonts w:eastAsia="Times New Roman" w:cs="Times New Roman"/>
+          <w:szCs w:val="28"/>
+        </w:rPr>
+      </w:pPr>
+      <w:r>
+        <w:rPr>
+          <w:rFonts w:eastAsia="Times New Roman" w:cs="Times New Roman"/>
+          <w:szCs w:val="28"/>
+        </w:rPr>
+        <w:t xml:space="preserve">Чтобы убедиться, что сервер работает корректно после каждой модификации кода, нужно проверить вывод в терминале (нет ошибок), открыть браузер или </w:t>
+      </w:r>
+      <w:proofErr w:type="spellStart"/>
+      <w:r>
+        <w:rPr>
+          <w:rFonts w:eastAsia="Times New Roman" w:cs="Times New Roman"/>
+          <w:i/>
+          <w:iCs/>
+          <w:szCs w:val="28"/>
+        </w:rPr>
+        <w:t>Thunder</w:t>
+      </w:r>
+      <w:proofErr w:type="spellEnd"/>
+      <w:r>
+        <w:rPr>
+          <w:rFonts w:eastAsia="Times New Roman" w:cs="Times New Roman"/>
+          <w:i/>
+          <w:iCs/>
+          <w:szCs w:val="28"/>
+        </w:rPr>
+        <w:t xml:space="preserve"> Client</w:t>
+      </w:r>
+      <w:r>
+        <w:rPr>
+          <w:rFonts w:eastAsia="Times New Roman" w:cs="Times New Roman"/>
+          <w:szCs w:val="28"/>
+        </w:rPr>
+        <w:t xml:space="preserve"> и отправить тестовый запрос (например, </w:t>
+      </w:r>
+      <w:r>
+        <w:rPr>
+          <w:rFonts w:eastAsia="Times New Roman" w:cs="Times New Roman"/>
+          <w:i/>
+          <w:iCs/>
+          <w:szCs w:val="28"/>
+        </w:rPr>
+        <w:t>GET /</w:t>
+      </w:r>
+      <w:r>
+        <w:rPr>
+          <w:rFonts w:eastAsia="Times New Roman" w:cs="Times New Roman"/>
+          <w:i/>
+          <w:iCs/>
+          <w:szCs w:val="28"/>
+        </w:rPr>
+        <w:t xml:space="preserve"> </w:t>
+      </w:r>
+      <w:r>
+        <w:rPr>
+          <w:rFonts w:eastAsia="Times New Roman" w:cs="Times New Roman"/>
+          <w:i/>
+          <w:iCs/>
+          <w:szCs w:val="28"/>
+          <w:lang w:val="en-US"/>
+        </w:rPr>
+        <w:t>items</w:t>
+      </w:r>
+      <w:r>
+        <w:rPr>
+          <w:rFonts w:eastAsia="Times New Roman" w:cs="Times New Roman"/>
+          <w:szCs w:val="28"/>
+        </w:rPr>
+        <w:t>), убедившись в правильном статусе и теле ответа.</w:t>
+      </w:r>
+    </w:p>
+    <w:p>
+      <w:pPr>
+        <w:spacing w:after="0" w:line="360" w:lineRule="exact"/>
+        <w:rPr>
+          <w:rFonts w:eastAsia="Times New Roman" w:cs="Times New Roman"/>
+          <w:szCs w:val="28"/>
+        </w:rPr>
+      </w:pPr>
+      <w:r>
+        <w:rPr>
+          <w:rFonts w:eastAsia="Times New Roman" w:cs="Times New Roman"/>
+          <w:szCs w:val="28"/>
+        </w:rPr>
+        <w:t xml:space="preserve">Чтобы запустить приложение на другом компьютере, нужно: скопировать проект (или клонировать с </w:t>
+      </w:r>
+      <w:proofErr w:type="spellStart"/>
+      <w:r>
+        <w:rPr>
+          <w:rFonts w:eastAsia="Times New Roman" w:cs="Times New Roman"/>
+          <w:i/>
+          <w:iCs/>
+          <w:szCs w:val="28"/>
+        </w:rPr>
+        <w:t>GitHub</w:t>
+      </w:r>
+      <w:proofErr w:type="spellEnd"/>
+      <w:r>
+        <w:rPr>
+          <w:rFonts w:eastAsia="Times New Roman" w:cs="Times New Roman"/>
+          <w:szCs w:val="28"/>
+        </w:rPr>
+        <w:t xml:space="preserve">), установить </w:t>
+      </w:r>
+      <w:r>
+        <w:rPr>
+          <w:rFonts w:eastAsia="Times New Roman" w:cs="Times New Roman"/>
+          <w:i/>
+          <w:iCs/>
+          <w:szCs w:val="28"/>
+        </w:rPr>
+        <w:t>Node.js</w:t>
+      </w:r>
+      <w:r>
+        <w:rPr>
+          <w:rFonts w:eastAsia="Times New Roman" w:cs="Times New Roman"/>
+          <w:szCs w:val="28"/>
+        </w:rPr>
+        <w:t>, выполнить `</w:t>
+      </w:r>
+      <w:proofErr w:type="spellStart"/>
+      <w:r>
+        <w:rPr>
+          <w:rFonts w:eastAsia="Times New Roman" w:cs="Times New Roman"/>
+          <w:i/>
+          <w:iCs/>
+          <w:szCs w:val="28"/>
+        </w:rPr>
+        <w:t>npm</w:t>
+      </w:r>
+      <w:proofErr w:type="spellEnd"/>
+      <w:r>
+        <w:rPr>
+          <w:rFonts w:eastAsia="Times New Roman" w:cs="Times New Roman"/>
+          <w:i/>
+          <w:iCs/>
+          <w:szCs w:val="28"/>
+        </w:rPr>
+        <w:t xml:space="preserve"> </w:t>
+      </w:r>
+      <w:proofErr w:type="spellStart"/>
+      <w:r>
+        <w:rPr>
+          <w:rFonts w:eastAsia="Times New Roman" w:cs="Times New Roman"/>
+          <w:i/>
+          <w:iCs/>
+          <w:szCs w:val="28"/>
+        </w:rPr>
+        <w:t>install</w:t>
+      </w:r>
+      <w:proofErr w:type="spellEnd"/>
+      <w:r>
+        <w:rPr>
+          <w:rFonts w:eastAsia="Times New Roman" w:cs="Times New Roman"/>
+          <w:i/>
+          <w:iCs/>
+          <w:szCs w:val="28"/>
+        </w:rPr>
+        <w:t>`</w:t>
+      </w:r>
+      <w:r>
+        <w:rPr>
+          <w:rFonts w:eastAsia="Times New Roman" w:cs="Times New Roman"/>
+          <w:szCs w:val="28"/>
+        </w:rPr>
+        <w:t xml:space="preserve"> для установки зависимостей, затем запустить сервер командой `</w:t>
+      </w:r>
+      <w:proofErr w:type="spellStart"/>
+      <w:r>
+        <w:rPr>
+          <w:rFonts w:eastAsia="Times New Roman" w:cs="Times New Roman"/>
+          <w:i/>
+          <w:iCs/>
+          <w:szCs w:val="28"/>
+        </w:rPr>
+        <w:t>npm</w:t>
+      </w:r>
+      <w:proofErr w:type="spellEnd"/>
+      <w:r>
+        <w:rPr>
+          <w:rFonts w:eastAsia="Times New Roman" w:cs="Times New Roman"/>
+          <w:i/>
+          <w:iCs/>
+          <w:szCs w:val="28"/>
+        </w:rPr>
+        <w:t xml:space="preserve"> </w:t>
+      </w:r>
+      <w:proofErr w:type="spellStart"/>
+      <w:r>
+        <w:rPr>
+          <w:rFonts w:eastAsia="Times New Roman" w:cs="Times New Roman"/>
+          <w:i/>
+          <w:iCs/>
+          <w:szCs w:val="28"/>
+        </w:rPr>
+        <w:t>run</w:t>
+      </w:r>
+      <w:proofErr w:type="spellEnd"/>
+      <w:r>
+        <w:rPr>
+          <w:rFonts w:eastAsia="Times New Roman" w:cs="Times New Roman"/>
+          <w:i/>
+          <w:iCs/>
+          <w:szCs w:val="28"/>
+        </w:rPr>
+        <w:t xml:space="preserve"> </w:t>
+      </w:r>
+      <w:proofErr w:type="spellStart"/>
+      <w:r>
+        <w:rPr>
+          <w:rFonts w:eastAsia="Times New Roman" w:cs="Times New Roman"/>
+          <w:i/>
+          <w:iCs/>
+          <w:szCs w:val="28"/>
+        </w:rPr>
+        <w:t>dev</w:t>
+      </w:r>
+      <w:proofErr w:type="spellEnd"/>
+      <w:r>
+        <w:rPr>
+          <w:rFonts w:eastAsia="Times New Roman" w:cs="Times New Roman"/>
+          <w:szCs w:val="28"/>
+        </w:rPr>
+        <w:t>` или `</w:t>
+      </w:r>
+      <w:proofErr w:type="spellStart"/>
+      <w:r>
+        <w:rPr>
+          <w:rFonts w:eastAsia="Times New Roman" w:cs="Times New Roman"/>
+          <w:i/>
+          <w:iCs/>
+          <w:szCs w:val="28"/>
+        </w:rPr>
+        <w:t>npm</w:t>
+      </w:r>
+      <w:proofErr w:type="spellEnd"/>
+      <w:r>
+        <w:rPr>
+          <w:rFonts w:eastAsia="Times New Roman" w:cs="Times New Roman"/>
+          <w:i/>
+          <w:iCs/>
+          <w:szCs w:val="28"/>
+        </w:rPr>
+        <w:t xml:space="preserve"> </w:t>
+      </w:r>
+      <w:proofErr w:type="spellStart"/>
+      <w:r>
+        <w:rPr>
+          <w:rFonts w:eastAsia="Times New Roman" w:cs="Times New Roman"/>
+          <w:i/>
+          <w:iCs/>
+          <w:szCs w:val="28"/>
+        </w:rPr>
+        <w:t>start</w:t>
+      </w:r>
+      <w:proofErr w:type="spellEnd"/>
+      <w:r>
+        <w:rPr>
+          <w:rFonts w:eastAsia="Times New Roman" w:cs="Times New Roman"/>
+          <w:i/>
+          <w:iCs/>
+          <w:szCs w:val="28"/>
+        </w:rPr>
+        <w:t>`.</w:t>
+      </w:r>
+    </w:p>
+    <w:p>
+      <w:pPr>
+        <w:pStyle w:val="1"/>
+        <w:spacing w:before="0" w:line="360" w:lineRule="exact"/>
+        <w:rPr>
+          <w:rFonts w:eastAsia="Times New Roman"/>
+        </w:rPr>
+      </w:pPr>
       <w:r>
         <w:rPr>
           <w:rFonts w:eastAsia="Times New Roman" w:cs="Times New Roman"/>
@@ -8878,6 +11081,19 @@
       <w:proofErr w:type="spellEnd"/>
       <w:r>
         <w:t xml:space="preserve"> с передачей параметров и реализации надежной системы валидации и централизованной обработки непредвиденных исключений. Вся серверная часть протестирована и подготовлена для интеграции с клиентской частью.</w:t>
+      </w:r>
+      <w:r>
+        <w:br/>
+      </w:r>
+      <w:r>
+        <w:br/>
+      </w:r>
+      <w:r>
+        <w:br/>
+        <w:t xml:space="preserve">ссылка на гит </w:t>
+      </w:r>
+      <w:r>
+        <w:t>https://github.com/GitSenia/item_rental_service.git</w:t>
       </w:r>
     </w:p>
     <w:sectPr>
@@ -13223,6 +15439,7 @@
   <w:style w:type="character" w:default="1" w:styleId="a0">
     <w:name w:val="Default Paragraph Font"/>
     <w:uiPriority w:val="1"/>
+    <w:semiHidden/>
     <w:unhideWhenUsed/>
   </w:style>
   <w:style w:type="table" w:default="1" w:styleId="a1">

</xml_diff>